<commit_message>
docs: fix physical-description field (27 pages, 10 citations)
Corrected the placeholder page/citation counts in the bibliographic card
(both Serbian and English) to the real values: 27 pages (as Word itself
renders it - LibreOffice's headless render said 26, close but not exact,
so the user's own Word count is the one that matters), 10 citations
(the 10 numbered sources in Литература).

A careless replace_all("26", "27") on the first pass also clobbered
YEAR and every literature entry's access date from 2026 to 2027 -
caught and reverted before regenerating.
</commit_message>
<xml_diff>
--- a/docs/diplomski-rad.docx
+++ b/docs/diplomski-rad.docx
@@ -1943,7 +1943,7 @@
                 <w:sz w:val="18"/>
                 <w:lang w:val="sr-Cyrl-RS"/>
               </w:rPr>
-              <w:t>7 поглавља / [ПОПУНИ: број страна] страна / [ПОПУНИ: број цитата] цитата / 3 табеле / 2 слике / 0 графика / 0 прилога</w:t>
+              <w:t>7 поглавља / 27 страна / 10 цитата / 3 табеле / 2 слике / 0 графика / 0 прилога</w:t>
             </w:r>
           </w:p>
         </w:tc>
@@ -4280,7 +4280,7 @@
                 <w:color w:val="FF0000"/>
                 <w:sz w:val="18"/>
               </w:rPr>
-              <w:t>7 chapters / [FILL IN: page count] pages / [FILL IN: reference count] references / 3 tables / 2 figures / 0 graphs / 0 appendixes</w:t>
+              <w:t>7 chapters / 27 pages / 10 references / 3 tables / 2 figures / 0 graphs / 0 appendixes</w:t>
             </w:r>
           </w:p>
         </w:tc>

</xml_diff>

<commit_message>
docs: actually fix physical-description field (still said POPUNI)
The field was assumed already patched to 27 pages / 10 citations when I
worked on the author's filled-in copy in the previous pass, but that copy
had branched off before that fix landed - never verified the field's
actual live text, just assumed it. Fixed directly now (Serbian and
English rows both).
</commit_message>
<xml_diff>
--- a/docs/diplomski-rad.docx
+++ b/docs/diplomski-rad.docx
@@ -2067,7 +2067,7 @@
                 <w:sz w:val="18"/>
                 <w:lang w:val="sr-Cyrl-RS"/>
               </w:rPr>
-              <w:t>7 поглавља / [ПОПУНИ: број страна] страна / [ПОПУНИ: број цитата] цитата / 3 табеле / 2 слике / 0 графика / 0 прилога</w:t>
+              <w:t>7 поглавља / 27 страна / 10 цитата / 3 табеле / 2 слике / 0 графика / 0 прилога</w:t>
             </w:r>
           </w:p>
         </w:tc>
@@ -4477,7 +4477,7 @@
                 <w:color w:val="FF0000"/>
                 <w:sz w:val="18"/>
               </w:rPr>
-              <w:t>7 chapters / [FILL IN: page count] pages / [FILL IN: reference count] references / 3 tables / 2 figures / 0 graphs / 0 appendixes</w:t>
+              <w:t>7 chapters / 27 pages / 10 references / 3 tables / 2 figures / 0 graphs / 0 appendixes</w:t>
             </w:r>
           </w:p>
         </w:tc>

</xml_diff>

<commit_message>
docs: make figure/table list page numbers self-updating (PAGEREF fields)
Replaced the hand-typed page numbers in Spisak slika/Spisak tabela with
real Word bookmark + PAGEREF fields (same mechanism the document's own
Sadrzaj/TOC already uses), anchored at each figure/table caption. They
now recalculate on Update Field instead of going stale every time the
document's page count shifts - which is exactly what happened here: the
figure/table pages I'd hand-typed earlier were computed from absolute PDF
sheet position rather than the printed (footer) page number, off by the
6 unnumbered front-matter pages, not from any real content drift. Set the
cached fallback text to the correct footer-relative values (11/13/15/17)
so the numbers already look right even before the author runs Update
Field, though Word will recompute them from the bookmarks regardless.
</commit_message>
<xml_diff>
--- a/docs/diplomski-rad.docx
+++ b/docs/diplomski-rad.docx
@@ -2057,17 +2057,40 @@
               <w:spacing w:before="60" w:after="60"/>
               <w:rPr>
                 <w:rFonts w:ascii="Arial" w:hAnsi="Arial"/>
-                <w:sz w:val="18"/>
+                <w:color w:val="auto"/>
+                <w:sz w:val="18"/>
+                <w:szCs w:val="18"/>
               </w:rPr>
             </w:pPr>
             <w:r>
               <w:rPr>
                 <w:rFonts w:ascii="Arial" w:hAnsi="Arial"/>
-                <w:color w:val="FF0000"/>
-                <w:sz w:val="18"/>
+                <w:color w:val="auto"/>
+                <w:sz w:val="18"/>
+                <w:szCs w:val="18"/>
                 <w:lang w:val="sr-Cyrl-RS"/>
               </w:rPr>
-              <w:t>7 поглавља / 27 страна / 10 цитата / 3 табеле / 2 слике / 0 графика / 0 прилога</w:t>
+              <w:t>7 поглавља / 2</w:t>
+            </w:r>
+            <w:r>
+              <w:rPr>
+                <w:rFonts w:ascii="Arial" w:hAnsi="Arial"/>
+                <w:color w:val="auto"/>
+                <w:sz w:val="18"/>
+                <w:szCs w:val="18"/>
+                <w:lang w:val="sr-Cyrl-RS"/>
+              </w:rPr>
+              <w:t>8</w:t>
+            </w:r>
+            <w:r>
+              <w:rPr>
+                <w:rFonts w:ascii="Arial" w:hAnsi="Arial"/>
+                <w:color w:val="auto"/>
+                <w:sz w:val="18"/>
+                <w:szCs w:val="18"/>
+                <w:lang w:val="sr-Cyrl-RS"/>
+              </w:rPr>
+              <w:t xml:space="preserve"> страна / 10 цитата / 3 табеле / 2 слике / 0 графика / 0 прилога</w:t>
             </w:r>
           </w:p>
         </w:tc>
@@ -4468,16 +4491,37 @@
               <w:spacing w:before="60" w:after="60"/>
               <w:rPr>
                 <w:rFonts w:ascii="Arial" w:hAnsi="Arial"/>
-                <w:sz w:val="18"/>
+                <w:color w:val="auto"/>
+                <w:sz w:val="18"/>
+                <w:szCs w:val="18"/>
               </w:rPr>
             </w:pPr>
             <w:r>
               <w:rPr>
                 <w:rFonts w:ascii="Arial" w:hAnsi="Arial"/>
-                <w:color w:val="FF0000"/>
-                <w:sz w:val="18"/>
-              </w:rPr>
-              <w:t>7 chapters / 27 pages / 10 references / 3 tables / 2 figures / 0 graphs / 0 appendixes</w:t>
+                <w:color w:val="auto"/>
+                <w:sz w:val="18"/>
+                <w:szCs w:val="18"/>
+              </w:rPr>
+              <w:t>7 chapters / 2</w:t>
+            </w:r>
+            <w:r>
+              <w:rPr>
+                <w:rFonts w:ascii="Arial" w:hAnsi="Arial"/>
+                <w:color w:val="auto"/>
+                <w:sz w:val="18"/>
+                <w:szCs w:val="18"/>
+              </w:rPr>
+              <w:t>8</w:t>
+            </w:r>
+            <w:r>
+              <w:rPr>
+                <w:rFonts w:ascii="Arial" w:hAnsi="Arial"/>
+                <w:color w:val="auto"/>
+                <w:sz w:val="18"/>
+                <w:szCs w:val="18"/>
+              </w:rPr>
+              <w:t xml:space="preserve"> pages / 10 references / 3 tables / 2 figures / 0 graphs / 0 appendixes</w:t>
             </w:r>
           </w:p>
         </w:tc>
@@ -4620,14 +4664,32 @@
               <w:rPr>
                 <w:rFonts w:ascii="Arial" w:hAnsi="Arial"/>
                 <w:sz w:val="18"/>
+                <w:szCs w:val="18"/>
               </w:rPr>
             </w:pPr>
             <w:r>
               <w:rPr>
                 <w:rFonts w:ascii="Arial" w:hAnsi="Arial"/>
                 <w:sz w:val="18"/>
-              </w:rPr>
-              <w:t>Applied Software Engineering</w:t>
+                <w:szCs w:val="18"/>
+              </w:rPr>
+              <w:t>Power</w:t>
+            </w:r>
+            <w:r>
+              <w:rPr>
+                <w:rFonts w:ascii="Arial" w:hAnsi="Arial"/>
+                <w:sz w:val="18"/>
+                <w:szCs w:val="18"/>
+              </w:rPr>
+              <w:t xml:space="preserve"> Software Engineering</w:t>
+            </w:r>
+            <w:r>
+              <w:rPr>
+                <w:rFonts w:ascii="Arial" w:hAnsi="Arial"/>
+                <w:sz w:val="18"/>
+                <w:szCs w:val="18"/>
+              </w:rPr>
+              <w:t xml:space="preserve"> </w:t>
             </w:r>
           </w:p>
         </w:tc>
@@ -8573,20 +8635,50 @@
       <w:bookmarkEnd w:id="0"/>
       <w:proofErr w:type="spellEnd"/>
     </w:p>
-    <w:p>
+    <w:p xmlns:wp14="http://schemas.microsoft.com/office/word/2010/wordml" wp14:textId="77777777">
       <w:pPr>
         <w:pStyle w:val="BodyText"/>
       </w:pPr>
       <w:r>
-        <w:t>Слика 4.1. Архитектура система пре надоградње ................................ 17</w:t>
-      </w:r>
-    </w:p>
-    <w:p>
+        <w:t xml:space="preserve">Слика 4.1. Архитектура система пре надоградње ................................ </w:t>
+      </w:r>
+      <w:r>
+        <w:fldChar w:fldCharType="begin"/>
+      </w:r>
+      <w:r>
+        <w:instrText xml:space="preserve"> PAGEREF _Slika_4_1 \h </w:instrText>
+      </w:r>
+      <w:r>
+        <w:fldChar w:fldCharType="separate"/>
+      </w:r>
+      <w:r>
+        <w:t>11</w:t>
+      </w:r>
+      <w:r>
+        <w:fldChar w:fldCharType="end"/>
+      </w:r>
+    </w:p>
+    <w:p xmlns:wp14="http://schemas.microsoft.com/office/word/2010/wordml" wp14:textId="77777777">
       <w:pPr>
         <w:pStyle w:val="BodyText"/>
       </w:pPr>
       <w:r>
-        <w:t>Слика 5.1. TO-BE архитектура — додат observability слој ....................... 19</w:t>
+        <w:t xml:space="preserve">Слика 5.1. TO-BE архитектура — додат observability слој ....................... </w:t>
+      </w:r>
+      <w:r>
+        <w:fldChar w:fldCharType="begin"/>
+      </w:r>
+      <w:r>
+        <w:instrText xml:space="preserve"> PAGEREF _Slika_5_1 \h </w:instrText>
+      </w:r>
+      <w:r>
+        <w:fldChar w:fldCharType="separate"/>
+      </w:r>
+      <w:r>
+        <w:t>13</w:t>
+      </w:r>
+      <w:r>
+        <w:fldChar w:fldCharType="end"/>
       </w:r>
     </w:p>
     <w:p>
@@ -8648,20 +8740,50 @@
         <w:t>табела</w:t>
       </w:r>
     </w:p>
-    <w:p>
+    <w:p xmlns:wp14="http://schemas.microsoft.com/office/word/2010/wordml" wp14:textId="77777777">
       <w:pPr>
         <w:pStyle w:val="BodyText"/>
       </w:pPr>
       <w:r>
-        <w:t>Табела 5.1. Поређење система пре и после надоградње ........................... 21</w:t>
-      </w:r>
-    </w:p>
-    <w:p>
+        <w:t xml:space="preserve">Табела 5.1. Поређење система пре и после надоградње ........................... </w:t>
+      </w:r>
+      <w:r>
+        <w:fldChar w:fldCharType="begin"/>
+      </w:r>
+      <w:r>
+        <w:instrText xml:space="preserve"> PAGEREF _Tabela_5_1 \h </w:instrText>
+      </w:r>
+      <w:r>
+        <w:fldChar w:fldCharType="separate"/>
+      </w:r>
+      <w:r>
+        <w:t>15</w:t>
+      </w:r>
+      <w:r>
+        <w:fldChar w:fldCharType="end"/>
+      </w:r>
+    </w:p>
+    <w:p xmlns:wp14="http://schemas.microsoft.com/office/word/2010/wordml" wp14:textId="77777777">
       <w:pPr>
         <w:pStyle w:val="BodyText"/>
       </w:pPr>
       <w:r>
-        <w:t>Табела 6.1. Резултати аутоматизованог тестирања (dotnet test) .................. 23</w:t>
+        <w:t xml:space="preserve">Табела 6.1. Резултати аутоматизованог тестирања (dotnet test) .................. </w:t>
+      </w:r>
+      <w:r>
+        <w:fldChar w:fldCharType="begin"/>
+      </w:r>
+      <w:r>
+        <w:instrText xml:space="preserve"> PAGEREF _Tabela_6_1 \h </w:instrText>
+      </w:r>
+      <w:r>
+        <w:fldChar w:fldCharType="separate"/>
+      </w:r>
+      <w:r>
+        <w:t>17</w:t>
+      </w:r>
+      <w:r>
+        <w:fldChar w:fldCharType="end"/>
       </w:r>
     </w:p>
     <w:p>
@@ -8691,7 +8813,7 @@
         <w:t>листинга</w:t>
       </w:r>
     </w:p>
-    <w:p>
+    <w:p xmlns:wp14="http://schemas.microsoft.com/office/word/2010/wordml" wp14:textId="77777777">
       <w:pPr>
         <w:pStyle w:val="BodyText"/>
       </w:pPr>
@@ -8725,7 +8847,7 @@
       <w:bookmarkEnd w:id="2"/>
       <w:proofErr w:type="spellEnd"/>
     </w:p>
-    <w:p>
+    <w:p xmlns:wp14="http://schemas.microsoft.com/office/word/2010/wordml" wp14:textId="77777777">
       <w:pPr>
         <w:pStyle w:val="BodyText"/>
       </w:pPr>
@@ -8733,7 +8855,7 @@
         <w:t>API — Application Programming Interface (програмски интерфејс за приступ функционалностима)</w:t>
       </w:r>
     </w:p>
-    <w:p>
+    <w:p xmlns:wp14="http://schemas.microsoft.com/office/word/2010/wordml" wp14:textId="77777777">
       <w:pPr>
         <w:pStyle w:val="BodyText"/>
       </w:pPr>
@@ -8741,7 +8863,7 @@
         <w:t>CI/CD — Continuous Integration / Continuous Delivery (континуирана интеграција и испорука)</w:t>
       </w:r>
     </w:p>
-    <w:p>
+    <w:p xmlns:wp14="http://schemas.microsoft.com/office/word/2010/wordml" wp14:textId="77777777">
       <w:pPr>
         <w:pStyle w:val="BodyText"/>
       </w:pPr>
@@ -8749,7 +8871,7 @@
         <w:t>CPU — Central Processing Unit (централна процесорска јединица)</w:t>
       </w:r>
     </w:p>
-    <w:p>
+    <w:p xmlns:wp14="http://schemas.microsoft.com/office/word/2010/wordml" wp14:textId="77777777">
       <w:pPr>
         <w:pStyle w:val="BodyText"/>
       </w:pPr>
@@ -8757,7 +8879,7 @@
         <w:t>EF Core — Entity Framework Core (ORM оквир коришћен за приступ бази података)</w:t>
       </w:r>
     </w:p>
-    <w:p>
+    <w:p xmlns:wp14="http://schemas.microsoft.com/office/word/2010/wordml" wp14:textId="77777777">
       <w:pPr>
         <w:pStyle w:val="BodyText"/>
       </w:pPr>
@@ -8765,7 +8887,7 @@
         <w:t>HTTP — HyperText Transfer Protocol (протокол преноса хипертекста)</w:t>
       </w:r>
     </w:p>
-    <w:p>
+    <w:p xmlns:wp14="http://schemas.microsoft.com/office/word/2010/wordml" wp14:textId="77777777">
       <w:pPr>
         <w:pStyle w:val="BodyText"/>
       </w:pPr>
@@ -8773,7 +8895,7 @@
         <w:t>IEEE — Institute of Electrical and Electronics Engineers (стандард цитирања коришћен у раду)</w:t>
       </w:r>
     </w:p>
-    <w:p>
+    <w:p xmlns:wp14="http://schemas.microsoft.com/office/word/2010/wordml" wp14:textId="77777777">
       <w:pPr>
         <w:pStyle w:val="BodyText"/>
       </w:pPr>
@@ -8781,7 +8903,7 @@
         <w:t>JWT — JSON Web Token (формат токена за аутентикацију)</w:t>
       </w:r>
     </w:p>
-    <w:p>
+    <w:p xmlns:wp14="http://schemas.microsoft.com/office/word/2010/wordml" wp14:textId="77777777">
       <w:pPr>
         <w:pStyle w:val="BodyText"/>
       </w:pPr>
@@ -8789,7 +8911,7 @@
         <w:t>OTel — OpenTelemetry (стандард обсервабилности коришћен у раду)</w:t>
       </w:r>
     </w:p>
-    <w:p>
+    <w:p xmlns:wp14="http://schemas.microsoft.com/office/word/2010/wordml" wp14:textId="77777777">
       <w:pPr>
         <w:pStyle w:val="BodyText"/>
       </w:pPr>
@@ -8797,7 +8919,7 @@
         <w:t>OTLP — OpenTelemetry Protocol (протокол преноса телеметрије ка Collector-у)</w:t>
       </w:r>
     </w:p>
-    <w:p>
+    <w:p xmlns:wp14="http://schemas.microsoft.com/office/word/2010/wordml" wp14:textId="77777777">
       <w:pPr>
         <w:pStyle w:val="BodyText"/>
       </w:pPr>
@@ -8805,7 +8927,7 @@
         <w:t>RED — Rate, Errors, Duration (стандардна група метрика: стопа захтева, стопа грешака, трајање)</w:t>
       </w:r>
     </w:p>
-    <w:p>
+    <w:p xmlns:wp14="http://schemas.microsoft.com/office/word/2010/wordml" wp14:textId="77777777">
       <w:pPr>
         <w:pStyle w:val="BodyText"/>
       </w:pPr>
@@ -8813,7 +8935,7 @@
         <w:t>REST — Representational State Transfer (архитектурни стил веб API-ја)</w:t>
       </w:r>
     </w:p>
-    <w:p>
+    <w:p xmlns:wp14="http://schemas.microsoft.com/office/word/2010/wordml" wp14:textId="77777777">
       <w:pPr>
         <w:pStyle w:val="BodyText"/>
       </w:pPr>
@@ -8821,7 +8943,7 @@
         <w:t>SDK — Software Development Kit (скуп алата и библиотека за развој)</w:t>
       </w:r>
     </w:p>
-    <w:p>
+    <w:p xmlns:wp14="http://schemas.microsoft.com/office/word/2010/wordml" wp14:textId="77777777">
       <w:pPr>
         <w:pStyle w:val="BodyText"/>
       </w:pPr>
@@ -8829,7 +8951,7 @@
         <w:t>SF — Service Fabric (Microsoft-ова платформа за микросервисну оркестрацију)</w:t>
       </w:r>
     </w:p>
-    <w:p>
+    <w:p xmlns:wp14="http://schemas.microsoft.com/office/word/2010/wordml" wp14:textId="77777777">
       <w:pPr>
         <w:pStyle w:val="BodyText"/>
       </w:pPr>
@@ -8837,7 +8959,7 @@
         <w:t>SQL — Structured Query Language (језик за рад са релационим базама података)</w:t>
       </w:r>
     </w:p>
-    <w:p>
+    <w:p xmlns:wp14="http://schemas.microsoft.com/office/word/2010/wordml" wp14:textId="77777777">
       <w:pPr>
         <w:pStyle w:val="BodyText"/>
       </w:pPr>
@@ -8845,7 +8967,7 @@
         <w:t>W3C — World Wide Web Consortium (стандард за пропагацију trace контекста, traceparent)</w:t>
       </w:r>
     </w:p>
-    <w:p>
+    <w:p xmlns:wp14="http://schemas.microsoft.com/office/word/2010/wordml" wp14:textId="77777777">
       <w:pPr>
         <w:pStyle w:val="BodyText"/>
       </w:pPr>
@@ -10580,6 +10702,7 @@
       </w:r>
     </w:p>
     <w:p xmlns:wp14="http://schemas.microsoft.com/office/word/2010/wordml" wp14:textId="77777777">
+      <w:bookmarkStart w:id="100" w:name="_Slika_4_1"/>
       <w:pPr>
         <w:pStyle w:val="Slika"/>
         <w:jc w:val="center"/>
@@ -10587,6 +10710,7 @@
       <w:r>
         <w:t>Слика 4.1. Архитектура система пре надоградње</w:t>
       </w:r>
+      <w:bookmarkEnd w:id="100"/>
     </w:p>
     <w:p xmlns:wp14="http://schemas.microsoft.com/office/word/2010/wordml" wp14:textId="77777777">
       <w:pPr>
@@ -11066,6 +11190,7 @@
       </w:r>
     </w:p>
     <w:p xmlns:wp14="http://schemas.microsoft.com/office/word/2010/wordml" wp14:textId="77777777">
+      <w:bookmarkStart w:id="101" w:name="_Slika_5_1"/>
       <w:pPr>
         <w:pStyle w:val="Slika"/>
         <w:jc w:val="center"/>
@@ -11073,6 +11198,7 @@
       <w:r>
         <w:t>Слика 5.1. TO-BE архитектура — додат observability слој</w:t>
       </w:r>
+      <w:bookmarkEnd w:id="101"/>
     </w:p>
     <w:p xmlns:wp14="http://schemas.microsoft.com/office/word/2010/wordml" wp14:textId="77777777">
       <w:pPr>
@@ -11243,12 +11369,14 @@
       </w:r>
     </w:p>
     <w:p xmlns:wp14="http://schemas.microsoft.com/office/word/2010/wordml" wp14:textId="77777777">
+      <w:bookmarkStart w:id="102" w:name="_Tabela_5_1"/>
       <w:pPr>
         <w:pStyle w:val="Tabela"/>
       </w:pPr>
       <w:r>
         <w:t>Табела 5.1. Поређење система пре и после надоградње</w:t>
       </w:r>
+      <w:bookmarkEnd w:id="102"/>
     </w:p>
     <w:tbl>
       <w:tblPr>
@@ -11629,12 +11757,14 @@
       </w:r>
     </w:p>
     <w:p xmlns:wp14="http://schemas.microsoft.com/office/word/2010/wordml" wp14:textId="77777777">
+      <w:bookmarkStart w:id="103" w:name="_Tabela_6_1"/>
       <w:pPr>
         <w:pStyle w:val="Tabela"/>
       </w:pPr>
       <w:r>
         <w:t>Табела 6.1. Резултати аутоматизованог тестирања (dotnet test)</w:t>
       </w:r>
+      <w:bookmarkEnd w:id="103"/>
     </w:p>
     <w:tbl>
       <w:tblPr>
@@ -12170,189 +12300,299 @@
         <w:pStyle w:val="BodyText"/>
       </w:pPr>
       <w:r>
+        <w:rPr/>
+        <w:t>Дајана Булић</w:t>
+      </w:r>
+      <w:r>
+        <w:rPr/>
+        <w:t xml:space="preserve"> </w:t>
+      </w:r>
+      <w:r>
+        <w:rPr/>
+        <w:t>је</w:t>
+      </w:r>
+      <w:r>
+        <w:rPr/>
+        <w:t xml:space="preserve"> </w:t>
+      </w:r>
+      <w:r>
+        <w:rPr/>
+        <w:t>рођен</w:t>
+      </w:r>
+      <w:r>
+        <w:rPr/>
+        <w:t>а</w:t>
+      </w:r>
+      <w:r>
+        <w:rPr/>
+        <w:t xml:space="preserve"> </w:t>
+      </w:r>
+      <w:r>
+        <w:rPr/>
+        <w:t>2003</w:t>
+      </w:r>
+      <w:r>
+        <w:rPr/>
+        <w:t xml:space="preserve">. </w:t>
+      </w:r>
+      <w:r>
+        <w:rPr/>
+        <w:t>године</w:t>
+      </w:r>
+      <w:r>
+        <w:rPr/>
+        <w:t xml:space="preserve"> у </w:t>
+      </w:r>
+      <w:r>
+        <w:rPr/>
+        <w:t>Врбасу</w:t>
+      </w:r>
+      <w:r>
+        <w:rPr/>
+        <w:t xml:space="preserve">. </w:t>
+      </w:r>
+      <w:r>
+        <w:rPr/>
+        <w:t>Заврши</w:t>
+      </w:r>
+      <w:r>
+        <w:rPr/>
+        <w:t>ла</w:t>
+      </w:r>
+      <w:r>
+        <w:rPr/>
+        <w:t xml:space="preserve"> </w:t>
+      </w:r>
+      <w:r>
+        <w:rPr/>
+        <w:t>је</w:t>
+      </w:r>
+      <w:r>
+        <w:rPr/>
+        <w:t xml:space="preserve"> </w:t>
+      </w:r>
+      <w:r>
+        <w:rPr/>
+        <w:t>електротехничку</w:t>
+      </w:r>
+      <w:r>
+        <w:rPr/>
+        <w:t xml:space="preserve"> с</w:t>
+      </w:r>
+      <w:r>
         <w:rPr>
           <w:lang w:val="sr-Cyrl-RS"/>
         </w:rPr>
-        <w:t>Име и презиме</w:t>
-      </w:r>
-      <w:r>
-        <w:t xml:space="preserve"> </w:t>
-      </w:r>
-      <w:proofErr w:type="spellStart"/>
-      <w:r>
-        <w:t>је</w:t>
-      </w:r>
-      <w:proofErr w:type="spellEnd"/>
-      <w:r>
-        <w:t xml:space="preserve"> </w:t>
-      </w:r>
-      <w:proofErr w:type="spellStart"/>
-      <w:r>
-        <w:t>рођен</w:t>
-      </w:r>
-      <w:proofErr w:type="spellEnd"/>
-      <w:r>
-        <w:t xml:space="preserve"> </w:t>
+        <w:t>редњу школу</w:t>
+      </w:r>
+      <w:r>
+        <w:rPr>
+          <w:lang w:val="sr-Cyrl-RS"/>
+        </w:rPr>
+        <w:t xml:space="preserve"> Михајло Пупин</w:t>
       </w:r>
       <w:r>
         <w:rPr>
           <w:lang w:val="sr-Latn-RS"/>
         </w:rPr>
-        <w:t>XXXX</w:t>
-      </w:r>
-      <w:r>
+        <w:t xml:space="preserve"> </w:t>
+      </w:r>
+      <w:r>
+        <w:rPr/>
+        <w:t xml:space="preserve">у </w:t>
+      </w:r>
+      <w:r>
+        <w:rPr/>
+        <w:t>Новом Саду</w:t>
+      </w:r>
+      <w:r>
+        <w:rPr/>
         <w:t xml:space="preserve">. </w:t>
       </w:r>
-      <w:proofErr w:type="spellStart"/>
-      <w:r>
+      <w:r>
+        <w:rPr/>
+        <w:t>Факултет</w:t>
+      </w:r>
+      <w:r>
+        <w:rPr/>
+        <w:t xml:space="preserve"> </w:t>
+      </w:r>
+      <w:r>
+        <w:rPr/>
+        <w:t>техничких</w:t>
+      </w:r>
+      <w:r>
+        <w:rPr/>
+        <w:t xml:space="preserve"> </w:t>
+      </w:r>
+      <w:r>
+        <w:rPr/>
+        <w:t>наука</w:t>
+      </w:r>
+      <w:r>
+        <w:rPr/>
+        <w:t xml:space="preserve"> у Новом </w:t>
+      </w:r>
+      <w:r>
+        <w:rPr/>
+        <w:t>Саду</w:t>
+      </w:r>
+      <w:r>
+        <w:rPr/>
+        <w:t xml:space="preserve"> </w:t>
+      </w:r>
+      <w:r>
+        <w:rPr/>
+        <w:t>уписа</w:t>
+      </w:r>
+      <w:r>
+        <w:rPr/>
+        <w:t>ла</w:t>
+      </w:r>
+      <w:r>
+        <w:rPr/>
+        <w:t xml:space="preserve"> </w:t>
+      </w:r>
+      <w:r>
+        <w:rPr/>
+        <w:t>је</w:t>
+      </w:r>
+      <w:r>
+        <w:rPr/>
+        <w:t xml:space="preserve"> </w:t>
+      </w:r>
+      <w:r>
+        <w:rPr/>
+        <w:t>2022</w:t>
+      </w:r>
+      <w:r>
+        <w:rPr/>
+        <w:t xml:space="preserve">. </w:t>
+      </w:r>
+      <w:r>
+        <w:rPr/>
         <w:t>године</w:t>
       </w:r>
-      <w:proofErr w:type="spellEnd"/>
-      <w:r>
-        <w:t xml:space="preserve"> у </w:t>
-      </w:r>
-      <w:r>
-        <w:t>XXX</w:t>
-      </w:r>
-      <w:r>
+      <w:r>
+        <w:rPr/>
+        <w:t xml:space="preserve">, </w:t>
+      </w:r>
+      <w:r>
+        <w:rPr/>
+        <w:t>на</w:t>
+      </w:r>
+      <w:r>
+        <w:rPr/>
+        <w:t xml:space="preserve"> </w:t>
+      </w:r>
+      <w:r>
+        <w:rPr/>
+        <w:t>студијском</w:t>
+      </w:r>
+      <w:r>
+        <w:rPr/>
+        <w:t xml:space="preserve"> </w:t>
+      </w:r>
+      <w:r>
+        <w:rPr/>
+        <w:t>програму</w:t>
+      </w:r>
+      <w:r>
+        <w:rPr/>
+        <w:t xml:space="preserve"> Примењено </w:t>
+      </w:r>
+      <w:r>
+        <w:rPr/>
+        <w:t>софтверско</w:t>
+      </w:r>
+      <w:r>
+        <w:rPr/>
+        <w:t xml:space="preserve"> </w:t>
+      </w:r>
+      <w:r>
+        <w:rPr/>
+        <w:t>инжењерство</w:t>
+      </w:r>
+      <w:r>
+        <w:rPr/>
         <w:t xml:space="preserve">. </w:t>
       </w:r>
-      <w:proofErr w:type="spellStart"/>
-      <w:r>
-        <w:t>Завршио</w:t>
-      </w:r>
-      <w:proofErr w:type="spellEnd"/>
-      <w:r>
+      <w:r>
+        <w:rPr/>
+        <w:t>Испуни</w:t>
+      </w:r>
+      <w:r>
+        <w:rPr/>
+        <w:t>ла</w:t>
+      </w:r>
+      <w:r>
+        <w:rPr/>
         <w:t xml:space="preserve"> </w:t>
       </w:r>
-      <w:proofErr w:type="spellStart"/>
-      <w:r>
+      <w:r>
+        <w:rPr/>
         <w:t>је</w:t>
       </w:r>
-      <w:proofErr w:type="spellEnd"/>
-      <w:r>
+      <w:r>
+        <w:rPr/>
         <w:t xml:space="preserve"> </w:t>
       </w:r>
       <w:r>
-        <w:rPr>
-          <w:lang w:val="sr-Cyrl-RS"/>
-        </w:rPr>
-        <w:t xml:space="preserve">Средњу школу </w:t>
-      </w:r>
-      <w:r>
-        <w:rPr>
-          <w:lang w:val="sr-Latn-RS"/>
-        </w:rPr>
-        <w:t>XXX</w:t>
-      </w:r>
-      <w:r>
-        <w:t xml:space="preserve"> у </w:t>
-      </w:r>
-      <w:r>
-        <w:t>XXXX</w:t>
-      </w:r>
-      <w:r>
-        <w:t xml:space="preserve">. Факултет техничких наука у Новом </w:t>
-      </w:r>
-      <w:proofErr w:type="spellStart"/>
-      <w:r>
-        <w:t>Саду</w:t>
-      </w:r>
-      <w:proofErr w:type="spellEnd"/>
-      <w:r>
+        <w:rPr/>
+        <w:t>све</w:t>
+      </w:r>
+      <w:r>
+        <w:rPr/>
         <w:t xml:space="preserve"> </w:t>
       </w:r>
-      <w:proofErr w:type="spellStart"/>
-      <w:r>
-        <w:t>уписао</w:t>
-      </w:r>
-      <w:proofErr w:type="spellEnd"/>
-      <w:r>
+      <w:r>
+        <w:rPr/>
+        <w:t>обавезе</w:t>
+      </w:r>
+      <w:r>
+        <w:rPr/>
+        <w:t xml:space="preserve"> и </w:t>
+      </w:r>
+      <w:r>
+        <w:rPr/>
+        <w:t>положи</w:t>
+      </w:r>
+      <w:r>
+        <w:rPr/>
+        <w:t>ла</w:t>
+      </w:r>
+      <w:r>
+        <w:rPr/>
         <w:t xml:space="preserve"> </w:t>
       </w:r>
-      <w:proofErr w:type="spellStart"/>
-      <w:r>
-        <w:t>је</w:t>
-      </w:r>
-      <w:proofErr w:type="spellEnd"/>
-      <w:r>
+      <w:r>
+        <w:rPr/>
+        <w:t>све</w:t>
+      </w:r>
+      <w:r>
+        <w:rPr/>
         <w:t xml:space="preserve"> </w:t>
       </w:r>
       <w:r>
-        <w:t>XXXX</w:t>
-      </w:r>
-      <w:r>
-        <w:t xml:space="preserve">. године, на студијском програму Примењено софтверско инжењерство. </w:t>
-      </w:r>
-      <w:proofErr w:type="spellStart"/>
-      <w:r>
-        <w:t>Испунио</w:t>
-      </w:r>
-      <w:proofErr w:type="spellEnd"/>
-      <w:r>
+        <w:rPr/>
+        <w:t>испите</w:t>
+      </w:r>
+      <w:r>
+        <w:rPr/>
         <w:t xml:space="preserve"> </w:t>
       </w:r>
-      <w:proofErr w:type="spellStart"/>
-      <w:r>
-        <w:t>је</w:t>
-      </w:r>
-      <w:proofErr w:type="spellEnd"/>
-      <w:r>
+      <w:r>
+        <w:rPr/>
+        <w:t>предвиђене</w:t>
+      </w:r>
+      <w:r>
+        <w:rPr/>
         <w:t xml:space="preserve"> </w:t>
       </w:r>
-      <w:proofErr w:type="spellStart"/>
-      <w:r>
-        <w:t>све</w:t>
-      </w:r>
-      <w:proofErr w:type="spellEnd"/>
-      <w:r>
-        <w:t xml:space="preserve"> </w:t>
-      </w:r>
-      <w:proofErr w:type="spellStart"/>
-      <w:r>
-        <w:t>обавезе</w:t>
-      </w:r>
-      <w:proofErr w:type="spellEnd"/>
-      <w:r>
-        <w:t xml:space="preserve"> и </w:t>
-      </w:r>
-      <w:proofErr w:type="spellStart"/>
-      <w:r>
-        <w:t>положио</w:t>
-      </w:r>
-      <w:proofErr w:type="spellEnd"/>
-      <w:r>
-        <w:t xml:space="preserve"> </w:t>
-      </w:r>
-      <w:proofErr w:type="spellStart"/>
-      <w:r>
-        <w:t>све</w:t>
-      </w:r>
-      <w:proofErr w:type="spellEnd"/>
-      <w:r>
-        <w:t xml:space="preserve"> </w:t>
-      </w:r>
-      <w:proofErr w:type="spellStart"/>
-      <w:r>
-        <w:t>испите</w:t>
-      </w:r>
-      <w:proofErr w:type="spellEnd"/>
-      <w:r>
-        <w:t xml:space="preserve"> </w:t>
-      </w:r>
-      <w:proofErr w:type="spellStart"/>
-      <w:r>
-        <w:t>предвиђене</w:t>
-      </w:r>
-      <w:proofErr w:type="spellEnd"/>
-      <w:r>
-        <w:t xml:space="preserve"> </w:t>
-      </w:r>
-      <w:proofErr w:type="spellStart"/>
-      <w:r>
+      <w:r>
+        <w:rPr/>
         <w:t>студијским</w:t>
       </w:r>
-      <w:proofErr w:type="spellEnd"/>
       <w:r>
         <w:rPr>
           <w:lang w:val="sr-Cyrl-RS"/>
@@ -12360,14 +12600,15 @@
         <w:t xml:space="preserve"> планом и</w:t>
       </w:r>
       <w:r>
+        <w:rPr/>
         <w:t xml:space="preserve"> </w:t>
       </w:r>
-      <w:proofErr w:type="spellStart"/>
-      <w:r>
+      <w:r>
+        <w:rPr/>
         <w:t>програмом</w:t>
       </w:r>
-      <w:proofErr w:type="spellEnd"/>
-      <w:r>
+      <w:r>
+        <w:rPr/>
         <w:t>.</w:t>
       </w:r>
     </w:p>

</xml_diff>

<commit_message>
docs: remove 26 leftover blank paragraphs before Uvod
Left over from the original blank template, which used them as a crude
manual page-break to push 1. Uvod onto its own page back when there was
much less front-matter content before it. Now that Spisak slika/tabela/
listinga/skracenica have real content, this block was excess and left an
entire blank page. Removed - page count drops by one.
</commit_message>
<xml_diff>
--- a/docs/diplomski-rad.docx
+++ b/docs/diplomski-rad.docx
@@ -8974,190 +8974,6 @@
       <w:r>
         <w:t>YARP — Yet Another Reverse Proxy (reverse proxy библиотека коришћена у Gateway-у)</w:t>
       </w:r>
-    </w:p>
-    <w:p>
-      <w:pPr>
-        <w:pStyle w:val="BodyText"/>
-        <w:ind w:left="720" w:firstLine="0"/>
-        <w:jc w:val="left"/>
-      </w:pPr>
-    </w:p>
-    <w:p>
-      <w:pPr>
-        <w:rPr>
-          <w:lang w:val="sr-Cyrl-RS"/>
-        </w:rPr>
-      </w:pPr>
-    </w:p>
-    <w:p>
-      <w:pPr>
-        <w:rPr>
-          <w:lang w:val="sr-Cyrl-RS"/>
-        </w:rPr>
-      </w:pPr>
-    </w:p>
-    <w:p>
-      <w:pPr>
-        <w:rPr>
-          <w:lang w:val="sr-Cyrl-RS"/>
-        </w:rPr>
-      </w:pPr>
-    </w:p>
-    <w:p>
-      <w:pPr>
-        <w:rPr>
-          <w:lang w:val="sr-Cyrl-RS"/>
-        </w:rPr>
-      </w:pPr>
-    </w:p>
-    <w:p>
-      <w:pPr>
-        <w:rPr>
-          <w:lang w:val="sr-Cyrl-RS"/>
-        </w:rPr>
-      </w:pPr>
-    </w:p>
-    <w:p>
-      <w:pPr>
-        <w:rPr>
-          <w:lang w:val="sr-Cyrl-RS"/>
-        </w:rPr>
-      </w:pPr>
-    </w:p>
-    <w:p>
-      <w:pPr>
-        <w:rPr>
-          <w:lang w:val="sr-Cyrl-RS"/>
-        </w:rPr>
-      </w:pPr>
-    </w:p>
-    <w:p>
-      <w:pPr>
-        <w:rPr>
-          <w:lang w:val="sr-Cyrl-RS"/>
-        </w:rPr>
-      </w:pPr>
-    </w:p>
-    <w:p>
-      <w:pPr>
-        <w:rPr>
-          <w:lang w:val="sr-Cyrl-RS"/>
-        </w:rPr>
-      </w:pPr>
-    </w:p>
-    <w:p>
-      <w:pPr>
-        <w:rPr>
-          <w:lang w:val="sr-Cyrl-RS"/>
-        </w:rPr>
-      </w:pPr>
-    </w:p>
-    <w:p>
-      <w:pPr>
-        <w:rPr>
-          <w:lang w:val="sr-Cyrl-RS"/>
-        </w:rPr>
-      </w:pPr>
-    </w:p>
-    <w:p>
-      <w:pPr>
-        <w:rPr>
-          <w:lang w:val="sr-Cyrl-RS"/>
-        </w:rPr>
-      </w:pPr>
-    </w:p>
-    <w:p>
-      <w:pPr>
-        <w:rPr>
-          <w:lang w:val="sr-Cyrl-RS"/>
-        </w:rPr>
-      </w:pPr>
-    </w:p>
-    <w:p>
-      <w:pPr>
-        <w:rPr>
-          <w:lang w:val="sr-Cyrl-RS"/>
-        </w:rPr>
-      </w:pPr>
-    </w:p>
-    <w:p>
-      <w:pPr>
-        <w:rPr>
-          <w:lang w:val="sr-Cyrl-RS"/>
-        </w:rPr>
-      </w:pPr>
-    </w:p>
-    <w:p>
-      <w:pPr>
-        <w:rPr>
-          <w:lang w:val="sr-Cyrl-RS"/>
-        </w:rPr>
-      </w:pPr>
-    </w:p>
-    <w:p>
-      <w:pPr>
-        <w:rPr>
-          <w:lang w:val="sr-Cyrl-RS"/>
-        </w:rPr>
-      </w:pPr>
-    </w:p>
-    <w:p>
-      <w:pPr>
-        <w:rPr>
-          <w:lang w:val="sr-Cyrl-RS"/>
-        </w:rPr>
-      </w:pPr>
-    </w:p>
-    <w:p>
-      <w:pPr>
-        <w:rPr>
-          <w:lang w:val="sr-Cyrl-RS"/>
-        </w:rPr>
-      </w:pPr>
-    </w:p>
-    <w:p>
-      <w:pPr>
-        <w:rPr>
-          <w:lang w:val="sr-Cyrl-RS"/>
-        </w:rPr>
-      </w:pPr>
-    </w:p>
-    <w:p>
-      <w:pPr>
-        <w:rPr>
-          <w:lang w:val="sr-Cyrl-RS"/>
-        </w:rPr>
-      </w:pPr>
-    </w:p>
-    <w:p>
-      <w:pPr>
-        <w:rPr>
-          <w:lang w:val="sr-Cyrl-RS"/>
-        </w:rPr>
-      </w:pPr>
-    </w:p>
-    <w:p>
-      <w:pPr>
-        <w:rPr>
-          <w:lang w:val="sr-Cyrl-RS"/>
-        </w:rPr>
-      </w:pPr>
-    </w:p>
-    <w:p>
-      <w:pPr>
-        <w:rPr>
-          <w:lang w:val="sr-Cyrl-RS"/>
-        </w:rPr>
-      </w:pPr>
-    </w:p>
-    <w:p>
-      <w:pPr>
-        <w:tabs>
-          <w:tab w:val="left" w:pos="6799"/>
-          <w:tab w:val="left" w:pos="8913"/>
-          <w:tab w:val="right" w:pos="9922"/>
-        </w:tabs>
-      </w:pPr>
     </w:p>
     <w:p>
       <w:pPr>

</xml_diff>

<commit_message>
docs: fix title-page pagination overflow, correct page count to 19
- Naslov rada se prelama u 3 reda (duzi od placeholder teksta iz sablona
  koji je bio u 1 redu), pa je preostalih 15 praznih paragrafa iz razmaka
  guralo "Novi Sad, 2026" na pocetak strane 2 umesto na dno strane 1.
  Uklonjena 2 prazna paragrafa da se kompenzuje razlika; verifikovano
  render-om da "Novi Sad, 2026" sada ponovo sedi na dnu strane 1, identicno
  ponasanju originalnog sablona.
- Fizicki opis rada: 27 -> 19 strana (autorkin stvarni broj strana iz
  Word-a), ispravljeno u obe kartice (cirilicna i engleska).
</commit_message>
<xml_diff>
--- a/docs/diplomski-rad.docx
+++ b/docs/diplomski-rad.docx
@@ -536,27 +536,6 @@
         <w:jc w:val="center"/>
         <w:rPr>
           <w:rFonts w:ascii="Arial" w:hAnsi="Arial"/>
-          <w:sz w:val="32"/>
-          <w:szCs w:val="40"/>
-        </w:rPr>
-      </w:pPr>
-    </w:p>
-    <w:p>
-      <w:pPr>
-        <w:jc w:val="center"/>
-        <w:rPr>
-          <w:rFonts w:ascii="Arial" w:hAnsi="Arial"/>
-          <w:sz w:val="32"/>
-          <w:szCs w:val="40"/>
-          <w:lang w:val="sr-Cyrl-CS"/>
-        </w:rPr>
-      </w:pPr>
-    </w:p>
-    <w:p>
-      <w:pPr>
-        <w:jc w:val="center"/>
-        <w:rPr>
-          <w:rFonts w:ascii="Arial" w:hAnsi="Arial"/>
           <w:sz w:val="40"/>
           <w:szCs w:val="40"/>
           <w:lang w:val="sr-Cyrl-CS"/>
@@ -2137,7 +2116,7 @@
                 <w:szCs w:val="18"/>
                 <w:lang w:val="sr-Cyrl-RS"/>
               </w:rPr>
-              <w:t>7 поглавља / 2</w:t>
+              <w:t>7 поглавља / 1</w:t>
             </w:r>
             <w:r>
               <w:rPr>
@@ -2147,7 +2126,7 @@
                 <w:szCs w:val="18"/>
                 <w:lang w:val="sr-Cyrl-RS"/>
               </w:rPr>
-              <w:t>7</w:t>
+              <w:t>9</w:t>
             </w:r>
             <w:r>
               <w:rPr>
@@ -4683,7 +4662,7 @@
                 <w:sz w:val="18"/>
                 <w:szCs w:val="18"/>
               </w:rPr>
-              <w:t>7 chapters / 2</w:t>
+              <w:t>7 chapters / 1</w:t>
             </w:r>
             <w:r>
               <w:rPr>
@@ -4692,7 +4671,7 @@
                 <w:sz w:val="18"/>
                 <w:szCs w:val="18"/>
               </w:rPr>
-              <w:t>7</w:t>
+              <w:t>9</w:t>
             </w:r>
             <w:r>
               <w:rPr>

</xml_diff>

<commit_message>
docs: Sadrzaj page should have no header box at all, not a cleaned one
User feedback after the previous fix: the logo/university-name header box
should not be on the Sadrzaj page at all - it should match its sibling
list pages (Spisak slika, Spisak tabela, ...), which have no header
decoration whatsoever.

Replaced the logo+address header content on Sadrzaj's section with a truly
empty header paragraph, matching the exact structure already used by the
title page and Spisak slika sections (including the pBdr bottom=none
override needed to suppress the Header style's default separator line -
missed on the first pass, which left a stray horizontal line).

Verified: Sadrzaj page now renders identically to Spisak slika (no header
line, no logo, no text), 25 pages total, zero blank pages.
</commit_message>
<xml_diff>
--- a/docs/diplomski-rad.docx
+++ b/docs/diplomski-rad.docx
@@ -13532,436 +13532,12 @@
 
 <file path=word/header10.xml><?xml version="1.0" encoding="utf-8"?>
 <w:hdr xmlns:m="http://schemas.openxmlformats.org/officeDocument/2006/math" xmlns:mc="http://schemas.openxmlformats.org/markup-compatibility/2006" xmlns:mo="http://schemas.microsoft.com/office/mac/office/2008/main" xmlns:mv="urn:schemas-microsoft-com:mac:vml" xmlns:o="urn:schemas-microsoft-com:office:office" xmlns:r="http://schemas.openxmlformats.org/officeDocument/2006/relationships" xmlns:v="urn:schemas-microsoft-com:vml" xmlns:w10="urn:schemas-microsoft-com:office:word" xmlns:w14="http://schemas.microsoft.com/office/word/2010/wordml" xmlns:w="http://schemas.openxmlformats.org/wordprocessingml/2006/main" xmlns:wne="http://schemas.microsoft.com/office/word/2006/wordml" xmlns:wp14="http://schemas.microsoft.com/office/word/2010/wordprocessingDrawing" xmlns:wp="http://schemas.openxmlformats.org/drawingml/2006/wordprocessingDrawing" xmlns:wpc="http://schemas.microsoft.com/office/word/2010/wordprocessingCanvas" xmlns:wpg="http://schemas.microsoft.com/office/word/2010/wordprocessingGroup" xmlns:wpi="http://schemas.microsoft.com/office/word/2010/wordprocessingInk" xmlns:wps="http://schemas.microsoft.com/office/word/2010/wordprocessingShape" mc:Ignorable="w14 wp14">
-  <w:tbl>
-    <w:tblPr>
-      <w:tblW w:w="0" w:type="auto"/>
-      <w:tblInd w:w="15" w:type="dxa"/>
-      <w:tblBorders>
-        <w:top w:val="single" w:color="auto" w:sz="4" w:space="0"/>
-        <w:left w:val="single" w:color="auto" w:sz="4" w:space="0"/>
-        <w:bottom w:val="single" w:color="auto" w:sz="4" w:space="0"/>
-        <w:right w:val="single" w:color="auto" w:sz="4" w:space="0"/>
-        <w:insideH w:val="single" w:color="auto" w:sz="4" w:space="0"/>
-        <w:insideV w:val="single" w:color="auto" w:sz="4" w:space="0"/>
-      </w:tblBorders>
-      <w:tblLayout w:type="fixed"/>
-      <w:tblCellMar>
-        <w:left w:w="0" w:type="dxa"/>
-        <w:right w:w="0" w:type="dxa"/>
-      </w:tblCellMar>
-      <w:tblLook w:val="0000" w:firstRow="0" w:lastRow="0" w:firstColumn="0" w:lastColumn="0" w:noHBand="0" w:noVBand="0"/>
-    </w:tblPr>
-    <w:tblGrid>
-      <w:gridCol w:w="1418"/>
-      <w:gridCol w:w="7875"/>
-    </w:tblGrid>
-    <w:tr>
-      <w:trPr>
-        <w:cantSplit/>
-        <w:trHeight w:val="345"/>
-      </w:trPr>
-      <w:tc>
-        <w:tcPr>
-          <w:tcW w:w="1418" w:type="dxa"/>
-          <w:vMerge w:val="restart"/>
-          <w:tcBorders>
-            <w:top w:val="single" w:color="auto" w:sz="12" w:space="0"/>
-            <w:left w:val="single" w:color="auto" w:sz="12" w:space="0"/>
-            <w:bottom w:val="nil"/>
-            <w:right w:val="nil"/>
-          </w:tcBorders>
-          <w:vAlign w:val="center"/>
-        </w:tcPr>
-        <w:p>
-          <w:pPr>
-            <w:jc w:val="center"/>
-            <w:rPr>
-              <w:rFonts w:ascii="Arial" w:hAnsi="Arial"/>
-              <w:sz w:val="20"/>
-            </w:rPr>
-          </w:pPr>
-          <w:r>
-            <w:rPr>
-              <w:noProof/>
-            </w:rPr>
-            <w:drawing>
-              <wp:inline distT="0" distB="0" distL="0" distR="0" wp14:anchorId="3EEBECE5" wp14:editId="73FCD2F6">
-                <wp:extent cx="775335" cy="856615"/>
-                <wp:effectExtent l="0" t="0" r="0" b="0"/>
-                <wp:docPr id="3" name="Picture 1" descr="A black and white logo&#10;&#10;AI-generated content may be incorrect."/>
-                <wp:cNvGraphicFramePr>
-                  <a:graphicFrameLocks xmlns:a="http://schemas.openxmlformats.org/drawingml/2006/main"/>
-                </wp:cNvGraphicFramePr>
-                <a:graphic xmlns:a="http://schemas.openxmlformats.org/drawingml/2006/main">
-                  <a:graphicData uri="http://schemas.openxmlformats.org/drawingml/2006/picture">
-                    <pic:pic xmlns:pic="http://schemas.openxmlformats.org/drawingml/2006/picture">
-                      <pic:nvPicPr>
-                        <pic:cNvPr id="0" name="Picture 1" descr="A black and white logo&#10;&#10;AI-generated content may be incorrect."/>
-                        <pic:cNvPicPr>
-                          <a:picLocks/>
-                        </pic:cNvPicPr>
-                      </pic:nvPicPr>
-                      <pic:blipFill>
-                        <a:blip r:embed="rId1">
-                          <a:extLst>
-                            <a:ext uri="{28A0092B-C50C-407E-A947-70E740481C1C}">
-                              <a14:useLocalDpi xmlns:a14="http://schemas.microsoft.com/office/drawing/2010/main" val="0"/>
-                            </a:ext>
-                          </a:extLst>
-                        </a:blip>
-                        <a:srcRect/>
-                        <a:stretch>
-                          <a:fillRect/>
-                        </a:stretch>
-                      </pic:blipFill>
-                      <pic:spPr bwMode="auto">
-                        <a:xfrm>
-                          <a:off x="0" y="0"/>
-                          <a:ext cx="775335" cy="856615"/>
-                        </a:xfrm>
-                        <a:prstGeom prst="rect">
-                          <a:avLst/>
-                        </a:prstGeom>
-                        <a:noFill/>
-                        <a:ln>
-                          <a:noFill/>
-                        </a:ln>
-                      </pic:spPr>
-                    </pic:pic>
-                  </a:graphicData>
-                </a:graphic>
-              </wp:inline>
-            </w:drawing>
-          </w:r>
-        </w:p>
-      </w:tc>
-      <w:tc>
-        <w:tcPr>
-          <w:tcW w:w="7875" w:type="dxa"/>
-          <w:vMerge w:val="restart"/>
-          <w:tcBorders>
-            <w:top w:val="single" w:color="auto" w:sz="12" w:space="0"/>
-            <w:left w:val="single" w:color="auto" w:sz="12" w:space="0"/>
-            <w:bottom w:val="nil"/>
-            <w:right w:val="single" w:color="auto" w:sz="12" w:space="0"/>
-          </w:tcBorders>
-        </w:tcPr>
-        <w:p>
-          <w:pPr>
-            <w:pStyle w:val="ime"/>
-            <w:spacing w:before="120"/>
-            <w:ind w:left="57" w:right="57"/>
-            <w:rPr>
-              <w:rFonts w:ascii="Arial" w:hAnsi="Arial"/>
-              <w:spacing w:val="-8"/>
-              <w:sz w:val="20"/>
-            </w:rPr>
-          </w:pPr>
-          <w:r>
-            <w:rPr>
-              <w:rFonts w:ascii="Arial" w:hAnsi="Arial"/>
-              <w:spacing w:val="-8"/>
-              <w:sz w:val="20"/>
-            </w:rPr>
-            <w:t xml:space="preserve">УНИВЕРЗИТЕТ У НОВОМ САДУ </w:t>
-          </w:r>
-          <w:r>
-            <w:rPr>
-              <w:rFonts w:ascii="Wingdings" w:hAnsi="Wingdings" w:eastAsia="Wingdings" w:cs="Wingdings"/>
-              <w:spacing w:val="-8"/>
-              <w:sz w:val="16"/>
-            </w:rPr>
-            <w:t>l</w:t>
-          </w:r>
-          <w:r>
-            <w:rPr>
-              <w:rFonts w:ascii="Arial" w:hAnsi="Arial"/>
-              <w:spacing w:val="-8"/>
-              <w:sz w:val="20"/>
-            </w:rPr>
-            <w:t xml:space="preserve"> </w:t>
-          </w:r>
-          <w:r>
-            <w:rPr>
-              <w:rFonts w:ascii="Arial" w:hAnsi="Arial"/>
-              <w:b/>
-              <w:spacing w:val="-8"/>
-              <w:sz w:val="20"/>
-            </w:rPr>
-            <w:t>ФАКУЛТЕТ ТЕХНИ</w:t>
-          </w:r>
-          <w:r>
-            <w:rPr>
-              <w:rFonts w:ascii="Arial" w:hAnsi="Arial"/>
-              <w:b/>
-              <w:spacing w:val="-8"/>
-              <w:sz w:val="20"/>
-              <w:lang w:val="sr-Cyrl-CS"/>
-            </w:rPr>
-            <w:t>Ч</w:t>
-          </w:r>
-          <w:r>
-            <w:rPr>
-              <w:rFonts w:ascii="Arial" w:hAnsi="Arial"/>
-              <w:b/>
-              <w:spacing w:val="-8"/>
-              <w:sz w:val="20"/>
-            </w:rPr>
-            <w:t>КИХ НАУКА</w:t>
-          </w:r>
-          <w:r>
-            <w:rPr>
-              <w:rFonts w:ascii="Arial" w:hAnsi="Arial"/>
-              <w:spacing w:val="-8"/>
-              <w:sz w:val="20"/>
-            </w:rPr>
-            <w:t xml:space="preserve"> </w:t>
-          </w:r>
-        </w:p>
-        <w:p>
-          <w:pPr>
-            <w:pStyle w:val="ime"/>
-            <w:spacing w:before="20"/>
-            <w:ind w:left="142" w:right="142"/>
-            <w:rPr>
-              <w:rFonts w:ascii="Arial" w:hAnsi="Arial"/>
-              <w:sz w:val="20"/>
-            </w:rPr>
-          </w:pPr>
-          <w:r>
-            <w:rPr>
-              <w:rFonts w:ascii="Arial" w:hAnsi="Arial"/>
-              <w:spacing w:val="26"/>
-              <w:sz w:val="20"/>
-            </w:rPr>
-            <w:t xml:space="preserve">21000 НОВИ САД, </w:t>
-          </w:r>
-          <w:proofErr w:type="spellStart"/>
-          <w:r>
-            <w:rPr>
-              <w:rFonts w:ascii="Arial" w:hAnsi="Arial"/>
-              <w:spacing w:val="26"/>
-              <w:sz w:val="20"/>
-            </w:rPr>
-            <w:t>Трг</w:t>
-          </w:r>
-          <w:proofErr w:type="spellEnd"/>
-          <w:r>
-            <w:rPr>
-              <w:rFonts w:ascii="Arial" w:hAnsi="Arial"/>
-              <w:spacing w:val="26"/>
-              <w:sz w:val="20"/>
-            </w:rPr>
-            <w:t xml:space="preserve"> </w:t>
-          </w:r>
-          <w:proofErr w:type="spellStart"/>
-          <w:r>
-            <w:rPr>
-              <w:rFonts w:ascii="Arial" w:hAnsi="Arial"/>
-              <w:spacing w:val="26"/>
-              <w:sz w:val="20"/>
-            </w:rPr>
-            <w:t>Доситеја</w:t>
-          </w:r>
-          <w:proofErr w:type="spellEnd"/>
-          <w:r>
-            <w:rPr>
-              <w:rFonts w:ascii="Arial" w:hAnsi="Arial"/>
-              <w:spacing w:val="26"/>
-              <w:sz w:val="20"/>
-            </w:rPr>
-            <w:t xml:space="preserve"> </w:t>
-          </w:r>
-          <w:proofErr w:type="spellStart"/>
-          <w:r>
-            <w:rPr>
-              <w:rFonts w:ascii="Arial" w:hAnsi="Arial"/>
-              <w:spacing w:val="26"/>
-              <w:sz w:val="20"/>
-            </w:rPr>
-            <w:t>Обрадови</w:t>
-          </w:r>
-          <w:proofErr w:type="spellEnd"/>
-          <w:r>
-            <w:rPr>
-              <w:rFonts w:ascii="Arial" w:hAnsi="Arial"/>
-              <w:spacing w:val="26"/>
-              <w:sz w:val="20"/>
-              <w:lang w:val="sr-Cyrl-CS"/>
-            </w:rPr>
-            <w:t>ћ</w:t>
-          </w:r>
-          <w:r>
-            <w:rPr>
-              <w:rFonts w:ascii="Arial" w:hAnsi="Arial"/>
-              <w:spacing w:val="26"/>
-              <w:sz w:val="20"/>
-            </w:rPr>
-            <w:t>а 6</w:t>
-          </w:r>
-        </w:p>
-      </w:tc>
-    </w:tr>
-    <w:tr>
-      <w:trPr>
-        <w:cantSplit/>
-        <w:trHeight w:val="345"/>
-      </w:trPr>
-      <w:tc>
-        <w:tcPr>
-          <w:tcW w:w="1418" w:type="dxa"/>
-          <w:vMerge/>
-          <w:tcBorders>
-            <w:top w:val="nil"/>
-            <w:left w:val="single" w:color="auto" w:sz="12" w:space="0"/>
-            <w:bottom w:val="nil"/>
-            <w:right w:val="nil"/>
-          </w:tcBorders>
-        </w:tcPr>
-        <w:p>
-          <w:pPr>
-            <w:ind w:left="142" w:right="142"/>
-            <w:jc w:val="center"/>
-            <w:rPr>
-              <w:rFonts w:ascii="Arial" w:hAnsi="Arial"/>
-              <w:sz w:val="20"/>
-            </w:rPr>
-          </w:pPr>
-        </w:p>
-      </w:tc>
-      <w:tc>
-        <w:tcPr>
-          <w:tcW w:w="7875" w:type="dxa"/>
-          <w:vMerge/>
-          <w:tcBorders>
-            <w:top w:val="nil"/>
-            <w:left w:val="single" w:color="auto" w:sz="12" w:space="0"/>
-            <w:bottom w:val="single" w:color="auto" w:sz="12" w:space="0"/>
-            <w:right w:val="single" w:color="auto" w:sz="12" w:space="0"/>
-          </w:tcBorders>
-        </w:tcPr>
-        <w:p>
-          <w:pPr>
-            <w:pStyle w:val="ime"/>
-            <w:spacing w:before="300"/>
-            <w:ind w:left="142" w:right="142"/>
-            <w:jc w:val="left"/>
-            <w:rPr>
-              <w:rFonts w:ascii="Arial" w:hAnsi="Arial"/>
-              <w:sz w:val="20"/>
-            </w:rPr>
-          </w:pPr>
-        </w:p>
-      </w:tc>
-    </w:tr>
-    <w:tr>
-      <w:trPr>
-        <w:cantSplit/>
-        <w:trHeight w:val="345"/>
-      </w:trPr>
-      <w:tc>
-        <w:tcPr>
-          <w:tcW w:w="1418" w:type="dxa"/>
-          <w:vMerge/>
-          <w:tcBorders>
-            <w:top w:val="nil"/>
-            <w:left w:val="single" w:color="auto" w:sz="12" w:space="0"/>
-            <w:bottom w:val="nil"/>
-            <w:right w:val="nil"/>
-          </w:tcBorders>
-        </w:tcPr>
-        <w:p>
-          <w:pPr>
-            <w:ind w:left="142" w:right="142"/>
-            <w:jc w:val="right"/>
-            <w:rPr>
-              <w:rFonts w:ascii="Arial" w:hAnsi="Arial"/>
-            </w:rPr>
-          </w:pPr>
-        </w:p>
-      </w:tc>
-      <w:tc>
-        <w:tcPr>
-          <w:tcW w:w="7875" w:type="dxa"/>
-          <w:vMerge w:val="restart"/>
-          <w:tcBorders>
-            <w:top w:val="nil"/>
-            <w:left w:val="single" w:color="auto" w:sz="12" w:space="0"/>
-            <w:bottom w:val="nil"/>
-            <w:right w:val="single" w:color="auto" w:sz="12" w:space="0"/>
-          </w:tcBorders>
-          <w:vAlign w:val="center"/>
-        </w:tcPr>
-        <w:p>
-          <w:pPr>
-            <w:pStyle w:val="ime"/>
-            <w:spacing w:before="0"/>
-            <w:ind w:left="142" w:right="142"/>
-            <w:rPr>
-              <w:rFonts w:ascii="Arial" w:hAnsi="Arial"/>
-              <w:b/>
-              <w:spacing w:val="-4"/>
-              <w:sz w:val="28"/>
-            </w:rPr>
-          </w:pPr>
-        </w:p>
-      </w:tc>
-    </w:tr>
-    <w:tr>
-      <w:trPr>
-        <w:cantSplit/>
-        <w:trHeight w:val="345"/>
-      </w:trPr>
-      <w:tc>
-        <w:tcPr>
-          <w:tcW w:w="1418" w:type="dxa"/>
-          <w:vMerge/>
-          <w:tcBorders>
-            <w:top w:val="nil"/>
-            <w:left w:val="single" w:color="auto" w:sz="12" w:space="0"/>
-            <w:bottom w:val="single" w:color="auto" w:sz="12" w:space="0"/>
-            <w:right w:val="nil"/>
-          </w:tcBorders>
-        </w:tcPr>
-        <w:p>
-          <w:pPr>
-            <w:ind w:left="142" w:right="142"/>
-            <w:jc w:val="right"/>
-            <w:rPr>
-              <w:rFonts w:ascii="Arial" w:hAnsi="Arial"/>
-            </w:rPr>
-          </w:pPr>
-        </w:p>
-      </w:tc>
-      <w:tc>
-        <w:tcPr>
-          <w:tcW w:w="7875" w:type="dxa"/>
-          <w:vMerge/>
-          <w:tcBorders>
-            <w:top w:val="nil"/>
-            <w:left w:val="single" w:color="auto" w:sz="12" w:space="0"/>
-            <w:bottom w:val="single" w:color="auto" w:sz="12" w:space="0"/>
-            <w:right w:val="single" w:color="auto" w:sz="12" w:space="0"/>
-          </w:tcBorders>
-        </w:tcPr>
-        <w:p>
-          <w:pPr>
-            <w:pStyle w:val="ime"/>
-            <w:spacing w:before="240"/>
-            <w:ind w:left="142" w:right="142"/>
-            <w:rPr>
-              <w:rFonts w:ascii="Arial" w:hAnsi="Arial"/>
-              <w:spacing w:val="-4"/>
-              <w:sz w:val="28"/>
-            </w:rPr>
-          </w:pPr>
-        </w:p>
-      </w:tc>
-    </w:tr>
-  </w:tbl>
   <w:p>
     <w:pPr>
       <w:pStyle w:val="Header"/>
+      <w:pBdr>
+        <w:bottom w:val="none" w:color="auto" w:sz="0" w:space="0"/>
+      </w:pBdr>
     </w:pPr>
   </w:p>
 </w:hdr>

</xml_diff>